<commit_message>
feat(site): add client collections and complete onboarding kits
</commit_message>
<xml_diff>
--- a/site/downloads/nuaforma-example-template.docx
+++ b/site/downloads/nuaforma-example-template.docx
@@ -86,7 +86,7 @@
     </w:p>
     <w:tbl>
       <w:tblPr>
-        <w:tblW w:type="auto" w:w="0"/>
+        <w:tblW w:type="dxa" w:w="8640"/>
         <w:tblLayout w:type="fixed"/>
         <w:tblLook w:firstColumn="1" w:firstRow="1" w:lastColumn="0" w:lastRow="0" w:noHBand="0" w:noVBand="1" w:val="04A0"/>
       </w:tblPr>
@@ -102,7 +102,7 @@
         </w:trPr>
         <w:tc>
           <w:tcPr>
-            <w:tcW w:type="dxa" w:w="2520"/>
+            <w:tcW w:type="dxa" w:w="4536"/>
             <w:vAlign w:val="center"/>
             <w:tcBorders>
               <w:top w:val="single" w:sz="4" w:color="D9D9D9"/>
@@ -134,7 +134,7 @@
         </w:tc>
         <w:tc>
           <w:tcPr>
-            <w:tcW w:type="dxa" w:w="2520"/>
+            <w:tcW w:type="dxa" w:w="864"/>
             <w:vAlign w:val="center"/>
             <w:tcBorders>
               <w:top w:val="single" w:sz="4" w:color="D9D9D9"/>
@@ -166,7 +166,7 @@
         </w:tc>
         <w:tc>
           <w:tcPr>
-            <w:tcW w:type="dxa" w:w="2520"/>
+            <w:tcW w:type="dxa" w:w="1584"/>
             <w:vAlign w:val="center"/>
             <w:tcBorders>
               <w:top w:val="single" w:sz="4" w:color="D9D9D9"/>
@@ -198,7 +198,7 @@
         </w:tc>
         <w:tc>
           <w:tcPr>
-            <w:tcW w:type="dxa" w:w="2520"/>
+            <w:tcW w:type="dxa" w:w="1656"/>
             <w:vAlign w:val="center"/>
             <w:tcBorders>
               <w:top w:val="single" w:sz="4" w:color="D9D9D9"/>
@@ -653,7 +653,7 @@
       <w:r>
         <w:drawing>
           <wp:inline xmlns:a="http://schemas.openxmlformats.org/drawingml/2006/main" xmlns:pic="http://schemas.openxmlformats.org/drawingml/2006/picture">
-            <wp:extent cx="6126480" cy="1021080"/>
+            <wp:extent cx="5486400" cy="914400"/>
             <wp:docPr id="2" name="Picture 2" descr="Template and structured data produce a document"/>
             <wp:cNvGraphicFramePr>
               <a:graphicFrameLocks noChangeAspect="1"/>
@@ -674,7 +674,7 @@
                   <pic:spPr>
                     <a:xfrm>
                       <a:off x="0" y="0"/>
-                      <a:ext cx="6126480" cy="1021080"/>
+                      <a:ext cx="5486400" cy="914400"/>
                     </a:xfrm>
                     <a:prstGeom prst="rect"/>
                   </pic:spPr>

</xml_diff>